<commit_message>
Update DATABASE_ERD with registry standards tables
</commit_message>
<xml_diff>
--- a/docs/technical/SECURITY_MODEL.docx
+++ b/docs/technical/SECURITY_MODEL.docx
@@ -18,7 +18,7 @@
         <w:t xml:space="preserve">The Archive and Heritage Group (Pty) Ltd</w:t>
       </w:r>
     </w:p>
-    <w:bookmarkStart w:id="38" w:name="atom-heratio-security-model"/>
+    <w:bookmarkStart w:id="41" w:name="atom-heratio-security-model"/>
     <w:p>
       <w:pPr>
         <w:pStyle w:val="Heading1"/>
@@ -2586,8 +2586,413 @@
         <w:t xml:space="preserve">uploads/</w:t>
       </w:r>
     </w:p>
+    <w:p>
+      <w:pPr>
+        <w:numPr>
+          <w:ilvl w:val="0"/>
+          <w:numId w:val="1010"/>
+        </w:numPr>
+        <w:pStyle w:val="Compact"/>
+      </w:pPr>
+      <w:r>
+        <w:t xml:space="preserve">☐ Nginx security headers hardened (HSTS, Permissions-Policy)</w:t>
+      </w:r>
+    </w:p>
+    <w:p>
+      <w:pPr>
+        <w:numPr>
+          <w:ilvl w:val="0"/>
+          <w:numId w:val="1010"/>
+        </w:numPr>
+        <w:pStyle w:val="Compact"/>
+      </w:pPr>
+      <w:r>
+        <w:t xml:space="preserve">☐ SPARQL/RiC API endpoints require authentication</w:t>
+      </w:r>
+    </w:p>
+    <w:p>
+      <w:pPr>
+        <w:numPr>
+          <w:ilvl w:val="0"/>
+          <w:numId w:val="1010"/>
+        </w:numPr>
+        <w:pStyle w:val="Compact"/>
+      </w:pPr>
+      <w:r>
+        <w:t xml:space="preserve">☐ Login endpoint rate-limited with fail2ban jail</w:t>
+      </w:r>
+    </w:p>
+    <w:p>
+      <w:pPr>
+        <w:numPr>
+          <w:ilvl w:val="0"/>
+          <w:numId w:val="1010"/>
+        </w:numPr>
+        <w:pStyle w:val="Compact"/>
+      </w:pPr>
+      <w:r>
+        <w:t xml:space="preserve">☐</w:t>
+      </w:r>
+      <w:r>
+        <w:t xml:space="preserve"> </w:t>
+      </w:r>
+      <w:r>
+        <w:rPr>
+          <w:rStyle w:val="VerbatimChar"/>
+        </w:rPr>
+        <w:t xml:space="preserve">server_tokens off</w:t>
+      </w:r>
+      <w:r>
+        <w:t xml:space="preserve"> </w:t>
+      </w:r>
+      <w:r>
+        <w:t xml:space="preserve">in nginx.conf</w:t>
+      </w:r>
+    </w:p>
+    <w:p>
+      <w:r>
+        <w:pict>
+          <v:rect style="width:0;height:1.5pt" o:hralign="center" o:hrstd="t" o:hr="t"/>
+        </w:pict>
+      </w:r>
+    </w:p>
     <w:bookmarkEnd w:id="37"/>
-    <w:bookmarkEnd w:id="38"/>
+    <w:bookmarkStart w:id="40" w:name="related-security-documents"/>
+    <w:p>
+      <w:pPr>
+        <w:pStyle w:val="Heading2"/>
+      </w:pPr>
+      <w:r>
+        <w:t xml:space="preserve">13. Related Security Documents</w:t>
+      </w:r>
+    </w:p>
+    <w:tbl>
+      <w:tblPr>
+        <w:tblStyle w:val="Table"/>
+        <w:tblW w:type="pct" w:w="5000"/>
+        <w:tblLook w:firstRow="1" w:lastRow="0" w:firstColumn="0" w:lastColumn="0" w:noHBand="0" w:noVBand="0" w:val="0020"/>
+        <w:jc w:val="start"/>
+      </w:tblPr>
+      <w:tblGrid>
+        <w:gridCol w:w="2731"/>
+        <w:gridCol w:w="2731"/>
+        <w:gridCol w:w="2457"/>
+      </w:tblGrid>
+      <w:tr>
+        <w:trPr>
+          <w:tblHeader w:val="true"/>
+        </w:trPr>
+        <w:tc>
+          <w:tcPr/>
+          <w:p>
+            <w:pPr>
+              <w:pStyle w:val="Compact"/>
+              <w:jc w:val="left"/>
+            </w:pPr>
+            <w:r>
+              <w:t xml:space="preserve">Document</w:t>
+            </w:r>
+          </w:p>
+        </w:tc>
+        <w:tc>
+          <w:tcPr/>
+          <w:p>
+            <w:pPr>
+              <w:pStyle w:val="Compact"/>
+              <w:jc w:val="left"/>
+            </w:pPr>
+            <w:r>
+              <w:t xml:space="preserve">Location</w:t>
+            </w:r>
+          </w:p>
+        </w:tc>
+        <w:tc>
+          <w:tcPr/>
+          <w:p>
+            <w:pPr>
+              <w:pStyle w:val="Compact"/>
+              <w:jc w:val="left"/>
+            </w:pPr>
+            <w:r>
+              <w:t xml:space="preserve">Content</w:t>
+            </w:r>
+          </w:p>
+        </w:tc>
+      </w:tr>
+      <w:tr>
+        <w:tc>
+          <w:tcPr/>
+          <w:p>
+            <w:pPr>
+              <w:pStyle w:val="Compact"/>
+              <w:jc w:val="left"/>
+            </w:pPr>
+            <w:hyperlink r:id="rId38">
+              <w:r>
+                <w:rPr>
+                  <w:rStyle w:val="Hyperlink"/>
+                </w:rPr>
+                <w:t xml:space="preserve">NGINX_SECURITY_HARDENING.md</w:t>
+              </w:r>
+            </w:hyperlink>
+          </w:p>
+        </w:tc>
+        <w:tc>
+          <w:tcPr/>
+          <w:p>
+            <w:pPr>
+              <w:pStyle w:val="Compact"/>
+              <w:jc w:val="left"/>
+            </w:pPr>
+            <w:r>
+              <w:rPr>
+                <w:rStyle w:val="VerbatimChar"/>
+              </w:rPr>
+              <w:t xml:space="preserve">docs/technical/</w:t>
+            </w:r>
+          </w:p>
+        </w:tc>
+        <w:tc>
+          <w:tcPr/>
+          <w:p>
+            <w:pPr>
+              <w:pStyle w:val="Compact"/>
+              <w:jc w:val="left"/>
+            </w:pPr>
+            <w:r>
+              <w:t xml:space="preserve">Nginx hardening guide for public-facing deployments</w:t>
+            </w:r>
+          </w:p>
+        </w:tc>
+      </w:tr>
+      <w:tr>
+        <w:tc>
+          <w:tcPr/>
+          <w:p>
+            <w:pPr>
+              <w:pStyle w:val="Compact"/>
+              <w:jc w:val="left"/>
+            </w:pPr>
+            <w:hyperlink r:id="rId39">
+              <w:r>
+                <w:rPr>
+                  <w:rStyle w:val="Hyperlink"/>
+                </w:rPr>
+                <w:t xml:space="preserve">M0_SECURITY_HARDENING.md</w:t>
+              </w:r>
+            </w:hyperlink>
+          </w:p>
+        </w:tc>
+        <w:tc>
+          <w:tcPr/>
+          <w:p>
+            <w:pPr>
+              <w:pStyle w:val="Compact"/>
+              <w:jc w:val="left"/>
+            </w:pPr>
+            <w:r>
+              <w:rPr>
+                <w:rStyle w:val="VerbatimChar"/>
+              </w:rPr>
+              <w:t xml:space="preserve">docs/technical/</w:t>
+            </w:r>
+          </w:p>
+        </w:tc>
+        <w:tc>
+          <w:tcPr/>
+          <w:p>
+            <w:pPr>
+              <w:pStyle w:val="Compact"/>
+              <w:jc w:val="left"/>
+            </w:pPr>
+            <w:r>
+              <w:t xml:space="preserve">PHP deserialization and upload hardening</w:t>
+            </w:r>
+          </w:p>
+        </w:tc>
+      </w:tr>
+      <w:tr>
+        <w:tc>
+          <w:tcPr/>
+          <w:p>
+            <w:pPr>
+              <w:pStyle w:val="Compact"/>
+              <w:jc w:val="left"/>
+            </w:pPr>
+            <w:hyperlink r:id="rId31">
+              <w:r>
+                <w:rPr>
+                  <w:rStyle w:val="Hyperlink"/>
+                </w:rPr>
+                <w:t xml:space="preserve">CSRF_POLICY.md</w:t>
+              </w:r>
+            </w:hyperlink>
+          </w:p>
+        </w:tc>
+        <w:tc>
+          <w:tcPr/>
+          <w:p>
+            <w:pPr>
+              <w:pStyle w:val="Compact"/>
+              <w:jc w:val="left"/>
+            </w:pPr>
+            <w:r>
+              <w:rPr>
+                <w:rStyle w:val="VerbatimChar"/>
+              </w:rPr>
+              <w:t xml:space="preserve">docs/technical/</w:t>
+            </w:r>
+          </w:p>
+        </w:tc>
+        <w:tc>
+          <w:tcPr/>
+          <w:p>
+            <w:pPr>
+              <w:pStyle w:val="Compact"/>
+              <w:jc w:val="left"/>
+            </w:pPr>
+            <w:r>
+              <w:t xml:space="preserve">Cross-site request forgery protection</w:t>
+            </w:r>
+          </w:p>
+        </w:tc>
+      </w:tr>
+      <w:tr>
+        <w:tc>
+          <w:tcPr/>
+          <w:p>
+            <w:pPr>
+              <w:pStyle w:val="Compact"/>
+              <w:jc w:val="left"/>
+            </w:pPr>
+            <w:hyperlink r:id="rId29">
+              <w:r>
+                <w:rPr>
+                  <w:rStyle w:val="Hyperlink"/>
+                </w:rPr>
+                <w:t xml:space="preserve">OUTBOUND_HTTP_POLICY.md</w:t>
+              </w:r>
+            </w:hyperlink>
+          </w:p>
+        </w:tc>
+        <w:tc>
+          <w:tcPr/>
+          <w:p>
+            <w:pPr>
+              <w:pStyle w:val="Compact"/>
+              <w:jc w:val="left"/>
+            </w:pPr>
+            <w:r>
+              <w:rPr>
+                <w:rStyle w:val="VerbatimChar"/>
+              </w:rPr>
+              <w:t xml:space="preserve">docs/technical/</w:t>
+            </w:r>
+          </w:p>
+        </w:tc>
+        <w:tc>
+          <w:tcPr/>
+          <w:p>
+            <w:pPr>
+              <w:pStyle w:val="Compact"/>
+              <w:jc w:val="left"/>
+            </w:pPr>
+            <w:r>
+              <w:t xml:space="preserve">SSRF prevention policy</w:t>
+            </w:r>
+          </w:p>
+        </w:tc>
+      </w:tr>
+      <w:tr>
+        <w:tc>
+          <w:tcPr/>
+          <w:p>
+            <w:pPr>
+              <w:pStyle w:val="Compact"/>
+              <w:jc w:val="left"/>
+            </w:pPr>
+            <w:hyperlink r:id="rId33">
+              <w:r>
+                <w:rPr>
+                  <w:rStyle w:val="Hyperlink"/>
+                </w:rPr>
+                <w:t xml:space="preserve">SHELL_EXECUTION_POLICY.md</w:t>
+              </w:r>
+            </w:hyperlink>
+          </w:p>
+        </w:tc>
+        <w:tc>
+          <w:tcPr/>
+          <w:p>
+            <w:pPr>
+              <w:pStyle w:val="Compact"/>
+              <w:jc w:val="left"/>
+            </w:pPr>
+            <w:r>
+              <w:rPr>
+                <w:rStyle w:val="VerbatimChar"/>
+              </w:rPr>
+              <w:t xml:space="preserve">docs/technical/</w:t>
+            </w:r>
+          </w:p>
+        </w:tc>
+        <w:tc>
+          <w:tcPr/>
+          <w:p>
+            <w:pPr>
+              <w:pStyle w:val="Compact"/>
+              <w:jc w:val="left"/>
+            </w:pPr>
+            <w:r>
+              <w:t xml:space="preserve">Shell command safety</w:t>
+            </w:r>
+          </w:p>
+        </w:tc>
+      </w:tr>
+      <w:tr>
+        <w:tc>
+          <w:tcPr/>
+          <w:p>
+            <w:pPr>
+              <w:pStyle w:val="Compact"/>
+              <w:jc w:val="left"/>
+            </w:pPr>
+            <w:r>
+              <w:t xml:space="preserve">Security Assessment Reports</w:t>
+            </w:r>
+          </w:p>
+        </w:tc>
+        <w:tc>
+          <w:tcPr/>
+          <w:p>
+            <w:pPr>
+              <w:pStyle w:val="Compact"/>
+              <w:jc w:val="left"/>
+            </w:pPr>
+            <w:r>
+              <w:rPr>
+                <w:rStyle w:val="VerbatimChar"/>
+              </w:rPr>
+              <w:t xml:space="preserve">docs/</w:t>
+            </w:r>
+          </w:p>
+        </w:tc>
+        <w:tc>
+          <w:tcPr/>
+          <w:p>
+            <w:pPr>
+              <w:pStyle w:val="Compact"/>
+              <w:jc w:val="left"/>
+            </w:pPr>
+            <w:r>
+              <w:t xml:space="preserve">Periodic security assessment findings</w:t>
+            </w:r>
+          </w:p>
+        </w:tc>
+      </w:tr>
+    </w:tbl>
+    <w:bookmarkEnd w:id="40"/>
+    <w:bookmarkEnd w:id="41"/>
     <w:sectPr/>
   </w:body>
 </w:document>

</xml_diff>